<commit_message>
rebuilt pwf docx fixed figure path
</commit_message>
<xml_diff>
--- a/chapters/exports/pwf.docx
+++ b/chapters/exports/pwf.docx
@@ -109,12 +109,12 @@
     </w:p>
     <w:p>
       <w:r>
-        <w:t xml:space="preserve">For decades western U.S. forests have accumulated undergrowth and small-diameter trees because of fire suppression and past management practices. That accumulation increases wildfire intensity, killing trees and releasing large pools of stored carbon. At a larger scale, this is contributing to ecosystem destruction. Removing that excess biomass is expensive and often produces large volumes of chips with little commercial value.</w:t>
-      </w:r>
-    </w:p>
-    <w:p>
-      <w:r>
-        <w:t xml:space="preserve">At the same time, the horticulture industry relies on vast quantities of potting substrate, historically supplied by peat moss harvested from peatlands, which destroys peatland ecosystems and their carbon stores. Peat moss harvest also releases large amounts of greenhouse gases, degrades biodiversity, and causes long‑term habitat loss. Additionally, logistical challenges and climate impacts have disrupted summer peat harvests in Canada—for example, yields fell by 25–50% in 2023—producing wide swings in peat price and availability; this volatility is a major concern for the horticulture industry, which expects to double or quadruple its use of potting substrates in coming decades.</w:t>
+        <w:t xml:space="preserve">For decades, western U.S. forests have accumulated undergrowth and small-diameter trees because of fire suppression and past management practices. That accumulation increases wildfire intensity, killing trees and releasing large pools of stored carbon. At a larger scale, this is contributing to ecosystem destruction. Removing that excess biomass is expensive and often produces large volumes of chips with little commercial value.</w:t>
+      </w:r>
+    </w:p>
+    <w:p>
+      <w:r>
+        <w:t xml:space="preserve">At the same time, the horticulture industry relies on vast quantities of potting substrate, historically supplied by peat moss harvested from peatlands, which destroys peatland ecosystems and their carbon stores. Peat moss harvest also releases large amounts of greenhouse gases, degrades biodiversity, and causes long‑term habitat loss. Additionally, logistical challenges and climate impacts have disrupted summer peat harvests in Canada—for example, yields fell by 25–50% in 2023—producing wide swings in peat price and availability; this volatility is a major concern for the horticulture industry, which expects to double or quadruple its use of potting substrates in the coming decades.</w:t>
       </w:r>
     </w:p>
     <w:p>
@@ -221,7 +221,7 @@
     </w:p>
     <w:p>
       <w:r>
-        <w:t xml:space="preserve">Plumas Wood Fiber’s business model ties feedstock procurement directly to forest restoration activity. The company will source wood chips produced by contractors performing fuels-reduction and restoration work on federal and private lands and purchase chips at prevailing market rates to ensure steady supply.</w:t>
+        <w:t xml:space="preserve">Plumas Wood Fiber’s business model ties feedstock procurement directly to forest restoration activity. The company will source wood chips produced by contractors performing fuels-reduction and restoration work on federal and private lands and purchase chips at prevailing market rates to ensure a steady supply.</w:t>
       </w:r>
     </w:p>
     <w:p>
@@ -495,7 +495,7 @@
     </w:p>
     <w:p>
       <w:r>
-        <w:t xml:space="preserve">In addition to extruders production lines and robotic baling and palletizing, commercial production requires a large chip-receiving yard and material-handling equipment. To reduce capital and operational expenses, the company is planning to co-locate its production facility with a biomass energy generation plant to be installed in Quincy California by West Biofuels of Woodland, Ca.</w:t>
+        <w:t xml:space="preserve">In addition to extruders, production lines, and robotic baling and palletizing, commercial production requires a large chip-receiving yard and material-handling equipment. To reduce capital and operational expenses, the company is planning to co-locate its production facility with a biomass energy generation plant to be installed in Quincy, California, by West Biofuels of Woodland, California.</w:t>
       </w:r>
     </w:p>
     <w:p>
@@ -572,7 +572,7 @@
         <w:t xml:space="preserve"> </w:t>
       </w:r>
       <w:r>
-        <w:t xml:space="preserve">Fiber extruder at wood fiber substrate production facility in Amsterdam. Plumas Wood Fiber’s facility will include a similar production line.</w:t>
+        <w:t xml:space="preserve">Fiber extruder at a wood fiber substrate production facility in Amsterdam. Plumas Wood Fiber’s facility will include a similar production line.</w:t>
       </w:r>
     </w:p>
     <w:p>
@@ -684,7 +684,7 @@
     </w:p>
     <w:p>
       <w:r>
-        <w:t xml:space="preserve">Public and philanthropic support funded early study and piloting activities: the California Department of Forestry and Fire Protection (CAL FIRE), the Plumas County Fire Safe Council, and the USDA Forest Service provided grants for a feasibility study and pre‑construction planning. Earlier this year, a Conservation X Labs Fire Grand Challenge award enabled a pilot collaboration between Plumas Wood Fiber and the Real Good Soil, which included procurement of a hammer mill to process Ponderosa pine chips into trial fiber that has recently be distributed to some 20 nurseries, academic institutions and other horticulture industry stakeholders for growth studies.</w:t>
+        <w:t xml:space="preserve">Public and philanthropic support funded early study and piloting activities: the California Department of Forestry and Fire Protection (CAL FIRE), the Plumas County Fire Safe Council, and the USDA Forest Service provided grants for a feasibility study and pre‑construction planning. Earlier this year, a Conservation X Labs Fire Grand Challenge award enabled a pilot collaboration between Plumas Wood Fiber and the Real Good Soil, which included procurement of a hammer mill to process Ponderosa pine chips into trial fiber that has recently been distributed to some 20 nurseries, academic institutions, and other horticulture industry stakeholders for growth studies.</w:t>
       </w:r>
     </w:p>
     <w:p>
@@ -694,7 +694,7 @@
     </w:p>
     <w:p>
       <w:r>
-        <w:t xml:space="preserve">Going forward, operational partnerships will be critical to Plumas Wood Fiber’s success: supply contracts and working relationships with forest contractors and public fuels programs will be necessary to secure steady volumes of chips and help manage seasonality, while early offtake discussions and letters of support from nurseries and soil‑blend companies identify clear commercial pathways. Similarly, strong financial partnerships —grants, impact finance and public loan programs— will be key to assembling the capital stack needed for commercial operations. These collaborative relationships—scientific, operational, and financial—form the backbone of Plumas Wood Fiber’s approach to turning excess forest biomass into a market‑ready, peat‑free substrate.</w:t>
+        <w:t xml:space="preserve">Going forward, operational partnerships will be critical to Plumas Wood Fiber’s success: supply contracts and working relationships with forest contractors and public fuels programs will be necessary to secure steady volumes of chips and help manage seasonality, while early offtake discussions and letters of support from nurseries and soil‑blend companies identify clear commercial pathways. Similarly, strong financial partnerships —grants, impact finance, and public loan programs— will be key to assembling the capital stack needed for commercial operations. These collaborative relationships—scientific, operational, and financial—form the backbone of Plumas Wood Fiber’s approach to turning excess forest biomass into a market‑ready, peat‑free substrate.</w:t>
       </w:r>
     </w:p>
     <w:p>
@@ -710,7 +710,7 @@
     </w:p>
     <w:p>
       <w:r>
-        <w:t xml:space="preserve">Due to its environmental and commmunity approach, Plumas Wood Fiber’s project will have multiple postiive environmental and social impacts.</w:t>
+        <w:t xml:space="preserve">Due to its environmental and community approach, Plumas Wood Fiber’s project will have multiple positive environmental and social impacts.</w:t>
       </w:r>
     </w:p>
     <w:p>
@@ -808,7 +808,7 @@
         <w:t xml:space="preserve"> </w:t>
       </w:r>
       <w:r>
-        <w:t xml:space="preserve">Peat storage bunker.</w:t>
+        <w:t xml:space="preserve">Wood fiber storage bunker in the Netherlands.</w:t>
       </w:r>
     </w:p>
     <w:p>
@@ -859,7 +859,7 @@
     </w:p>
     <w:p>
       <w:r>
-        <w:t xml:space="preserve">Nevertheless, if the validation work and early commercial runs confirm product performance at scale, Plumas Wood Fiber has clear expansion pathways. The model is replicable in other western-forest regions with similar fuels-treatment byproducts, enabling a distributed network of mid‑sized facilities that feed regional horticultural markets. Product innovation could lead to proprietary blends tailored to specific crops, bagged retail products for consumer markets, or preconditioned fibers designed for large greenhouse operations. Technological improvements—especially extruder energy-efficiency gains and automation in baling and loading—would materially improve margins. Strategic partnerships with large offtakers, soil-blend manufacturers, and impact investors seeking wildfire- and carbon-positive projects could secure long-term revenue streams and flexible capital. Support in the form of grants or incentives that internalize forest-restoration and carbon co-benefits could accelerate growth.</w:t>
+        <w:t xml:space="preserve">Nevertheless, if the validation work and early commercial runs confirm product performance at scale, Plumas Wood Fiber has clear expansion pathways. The model is replicable in other western forest regions with similar fuel treatment byproducts, enabling a distributed network of mid‑sized facilities that feed regional horticultural markets. Product innovation could lead to proprietary blends tailored to specific crops, bagged retail products for consumer markets, or preconditioned fibers designed for large greenhouse operations. Technological improvements—especially extruder energy-efficiency gains and automation in baling and loading—would materially improve margins. Strategic partnerships with large offtakers, soil-blend manufacturers, and impact investors seeking wildfire- and carbon-positive projects could secure long-term revenue streams and flexible capital. Support in the form of grants or incentives that internalize forest restoration and carbon co-benefits could accelerate growth.</w:t>
       </w:r>
     </w:p>
     <w:p>
@@ -979,7 +979,7 @@
       <w:r>
         <w:t xml:space="preserve">We recognize and celebrate the innovation and leadership of Plumas Wood Fiber for advancing a practical, circular solution that converts excess forest biomass into a high‑quality, peat‑free horticultural substrate while strengthening regional wildfire resilience. We also extend our deep gratitude to </w:t>
       </w:r>
-      <w:hyperlink w:history="1" r:id="rId0rtcpwpmu4sp98h00vgns">
+      <w:hyperlink w:history="1" r:id="rIdvhirifolycfcv1oj5rgdl">
         <w:r>
           <w:rPr>
             <w:rStyle w:val="Hyperlink"/>
@@ -990,7 +990,7 @@
       <w:r>
         <w:t xml:space="preserve"> for funding the Forest Business Alliance’s work with </w:t>
       </w:r>
-      <w:hyperlink w:history="1" r:id="rIdw_qqau8a4gqml_qgwbcn-">
+      <w:hyperlink w:history="1" r:id="rId3plsuuod3zy8_qzf1fkvh">
         <w:r>
           <w:rPr>
             <w:rStyle w:val="Hyperlink"/>
@@ -1001,7 +1001,7 @@
       <w:r>
         <w:t xml:space="preserve">, </w:t>
       </w:r>
-      <w:hyperlink w:history="1" r:id="rIdu5avepd_vxuga7spnl35n">
+      <w:hyperlink w:history="1" r:id="rIdpg5m6weceujs9uiqwkcsq">
         <w:r>
           <w:rPr>
             <w:rStyle w:val="Hyperlink"/>
@@ -1010,9 +1010,9 @@
         </w:r>
       </w:hyperlink>
       <w:r>
-        <w:t xml:space="preserve">, and other community forestry partners across California. Rural and Tribal communities engaged in the forest products sector can benefit from resources, such as The Forest Business Alliance </w:t>
-      </w:r>
-      <w:hyperlink w:history="1" r:id="rId9zr12jrgv_rxvgfhgg2fb">
+        <w:t xml:space="preserve">, and other community forestry partners across California. Rural and Tribal communities engaged in the forest products sector can benefit from resources, such as the Forest Business Alliance </w:t>
+      </w:r>
+      <w:hyperlink w:history="1" r:id="rIdujrovtrdottt2igse-osb">
         <w:r>
           <w:rPr>
             <w:rStyle w:val="Hyperlink"/>
@@ -1023,7 +1023,7 @@
       <w:r>
         <w:t xml:space="preserve">, the </w:t>
       </w:r>
-      <w:hyperlink w:history="1" r:id="rIdpxlqwtdhacflt1drxogpz">
+      <w:hyperlink w:history="1" r:id="rIdl2yjvika8a7cjdbd_4_mn">
         <w:r>
           <w:rPr>
             <w:rStyle w:val="Hyperlink"/>
@@ -1034,7 +1034,7 @@
       <w:r>
         <w:t xml:space="preserve">, and upcoming Forest Business Alliance </w:t>
       </w:r>
-      <w:hyperlink w:history="1" r:id="rIdf84f-n5syzc9drriglxc9">
+      <w:hyperlink w:history="1" r:id="rIdhy6kbgh2b47sioffftc7w">
         <w:r>
           <w:rPr>
             <w:rStyle w:val="Hyperlink"/>

</xml_diff>

<commit_message>
pwf fig 1.3 edit
</commit_message>
<xml_diff>
--- a/chapters/exports/pwf.docx
+++ b/chapters/exports/pwf.docx
@@ -490,7 +490,7 @@
         <w:t xml:space="preserve"> </w:t>
       </w:r>
       <w:r>
-        <w:t xml:space="preserve">Growth trials at North Carolina State University.</w:t>
+        <w:t xml:space="preserve">Growth trials at Texas A&amp;M University. Credit: Paul Winski.</w:t>
       </w:r>
     </w:p>
     <w:p>
@@ -979,7 +979,7 @@
       <w:r>
         <w:t xml:space="preserve">We recognize and celebrate the innovation and leadership of Plumas Wood Fiber for advancing a practical, circular solution that converts excess forest biomass into a high‑quality, peat‑free horticultural substrate while strengthening regional wildfire resilience. We also extend our deep gratitude to </w:t>
       </w:r>
-      <w:hyperlink w:history="1" r:id="rIdvhirifolycfcv1oj5rgdl">
+      <w:hyperlink w:history="1" r:id="rIdw9ixuojqfqwp4jip34u2d">
         <w:r>
           <w:rPr>
             <w:rStyle w:val="Hyperlink"/>
@@ -990,7 +990,7 @@
       <w:r>
         <w:t xml:space="preserve"> for funding the Forest Business Alliance’s work with </w:t>
       </w:r>
-      <w:hyperlink w:history="1" r:id="rId3plsuuod3zy8_qzf1fkvh">
+      <w:hyperlink w:history="1" r:id="rIdgb_-c8l-cnoo2epvvqdxo">
         <w:r>
           <w:rPr>
             <w:rStyle w:val="Hyperlink"/>
@@ -1001,7 +1001,7 @@
       <w:r>
         <w:t xml:space="preserve">, </w:t>
       </w:r>
-      <w:hyperlink w:history="1" r:id="rIdpg5m6weceujs9uiqwkcsq">
+      <w:hyperlink w:history="1" r:id="rIdh-pb3iyuj-vorqpmvmh4z">
         <w:r>
           <w:rPr>
             <w:rStyle w:val="Hyperlink"/>
@@ -1012,7 +1012,7 @@
       <w:r>
         <w:t xml:space="preserve">, and other community forestry partners across California. Rural and Tribal communities engaged in the forest products sector can benefit from resources, such as the Forest Business Alliance </w:t>
       </w:r>
-      <w:hyperlink w:history="1" r:id="rIdujrovtrdottt2igse-osb">
+      <w:hyperlink w:history="1" r:id="rIdxybqfl-h_gavqrpvn-fmt">
         <w:r>
           <w:rPr>
             <w:rStyle w:val="Hyperlink"/>
@@ -1023,7 +1023,7 @@
       <w:r>
         <w:t xml:space="preserve">, the </w:t>
       </w:r>
-      <w:hyperlink w:history="1" r:id="rIdl2yjvika8a7cjdbd_4_mn">
+      <w:hyperlink w:history="1" r:id="rIdwznm6xcpsvatnfse_yjz1">
         <w:r>
           <w:rPr>
             <w:rStyle w:val="Hyperlink"/>
@@ -1034,7 +1034,7 @@
       <w:r>
         <w:t xml:space="preserve">, and upcoming Forest Business Alliance </w:t>
       </w:r>
-      <w:hyperlink w:history="1" r:id="rIdhy6kbgh2b47sioffftc7w">
+      <w:hyperlink w:history="1" r:id="rIdotmwet0qjb6s5ijekcyil">
         <w:r>
           <w:rPr>
             <w:rStyle w:val="Hyperlink"/>
@@ -1048,7 +1048,7 @@
     </w:p>
     <w:p>
       <w:r>
-        <w:t xml:space="preserve">All photos in figures by Jeff Greef.</w:t>
+        <w:t xml:space="preserve">Unless indicated, all photos in figures by Jeff Greef.</w:t>
       </w:r>
     </w:p>
     <w:sectPr>

</xml_diff>

<commit_message>
jpg path fixed, pwf.docx export
</commit_message>
<xml_diff>
--- a/chapters/exports/pwf.docx
+++ b/chapters/exports/pwf.docx
@@ -216,7 +216,7 @@
         <w:t xml:space="preserve">1.3	</w:t>
       </w:r>
       <w:r>
-        <w:t xml:space="preserve">Model</w:t>
+        <w:t xml:space="preserve">Business model</w:t>
       </w:r>
     </w:p>
     <w:p>
@@ -289,17 +289,6 @@
     <w:p>
       <w:r>
         <w:t xml:space="preserve">These factors combine to lower delivered cost and greenhouse‑gas footprint while meeting the technical requirements buyers expect.</w:t>
-      </w:r>
-    </w:p>
-    <w:p>
-      <w:pPr>
-        <w:pStyle w:val="Heading2"/>
-      </w:pPr>
-      <w:r>
-        <w:t xml:space="preserve">1.4	</w:t>
-      </w:r>
-      <w:r>
-        <w:t xml:space="preserve">Scaling</w:t>
       </w:r>
     </w:p>
     <w:p>
@@ -585,6 +574,37 @@
         <w:pStyle w:val="Heading2"/>
       </w:pPr>
       <w:r>
+        <w:t xml:space="preserve">1.4	</w:t>
+      </w:r>
+      <w:r>
+        <w:t xml:space="preserve">Startup</w:t>
+      </w:r>
+    </w:p>
+    <w:p>
+      <w:r>
+        <w:t xml:space="preserve">Plumas Wood Fiber’s pathway to success is not without risk. Operationally, feedstock variability—moisture, particle size, seasonal availability—and the high capital intensity of extruder machinery raise the risk of production interruptions and cost overruns. Market adoption depends on the success of the growth trials to convince conservative horticultural buyers, while competition from established wood‑fiber suppliers and cheaper peat/coir blends may pressure price and uptake. Regulatory and policy risk exists in multiple forms: changes in fuels program funding could shrink chip volumes; permitting for a processing facility can introduce delays or unexpected costs; and potential shifts in environmental policy—positive or negative—could alter incentives for peat displacement or biomass utilization. Finally, the business depends on a blended capital stack of grants, concessional loans, and commercial finance to bridge capex, so reduced grant availability or loan delays could postpone commercialization.</w:t>
+      </w:r>
+    </w:p>
+    <w:p>
+      <w:r>
+        <w:t xml:space="preserve">Nevertheless, if the validation work and early commercial runs confirm product performance at scale, Plumas Wood Fiber has clear expansion pathways. The model is replicable in other western forest regions with similar fuel treatment byproducts, enabling a distributed network of mid‑sized facilities that feed regional horticultural markets. Product innovation could lead to proprietary blends tailored to specific crops, bagged retail products for consumer markets, or preconditioned fibers designed for large greenhouse operations. Technological improvements—especially extruder energy-efficiency gains and automation in baling and loading—would materially improve margins. Strategic partnerships with large offtakers, soil-blend manufacturers, and impact investors seeking wildfire- and carbon-positive projects could secure long-term revenue streams and flexible capital. Support in the form of grants or incentives that internalize forest restoration and carbon co-benefits could accelerate growth.</w:t>
+      </w:r>
+    </w:p>
+    <w:p>
+      <w:r>
+        <w:t xml:space="preserve">The horticultural industry is projected to significantly expand its use of substrates in the coming decades, with overall demand expected to double or even quadruple. Within that growth, wood fiber substrates are anticipated to see a tenfold increase in adoption—marking this as a high-potential sector where innovative start-ups are well-positioned to lead. However, establishing a viable industry for producing wood fiber substrate from Western forest biomass represents a novel approach for both forestry and horticulture. As a result, both sectors are currently adopting a cautious, wait-and-see stance.</w:t>
+      </w:r>
+    </w:p>
+    <w:p>
+      <w:r>
+        <w:t xml:space="preserve">Biomass enterprises inherently operate on tight margins due to the nature of the material—high volume, low value—and the logistical complexity of sourcing it. Building a viable business under these conditions demands careful planning, operational efficiency, sound partnerships, and strategic coordination. If Plumas Wood Fiber proves successful, it could unlock new opportunities for climate-smart forest management and sustainable horticultural supply chains. If not, it may dampen investor confidence and constrain future efforts to develop alternative biomass-based products. The stakes are high—but so is the opportunity.</w:t>
+      </w:r>
+    </w:p>
+    <w:p>
+      <w:pPr>
+        <w:pStyle w:val="Heading2"/>
+      </w:pPr>
+      <w:r>
         <w:t xml:space="preserve">1.5	</w:t>
       </w:r>
       <w:r>
@@ -849,37 +869,6 @@
         <w:t xml:space="preserve">1.7	</w:t>
       </w:r>
       <w:r>
-        <w:t xml:space="preserve">Startup</w:t>
-      </w:r>
-    </w:p>
-    <w:p>
-      <w:r>
-        <w:t xml:space="preserve">Plumas Wood Fiber’s pathway to success is not without risk. Operationally, feedstock variability—moisture, particle size, seasonal availability—and the high capital intensity of extruder machinery raise the risk of production interruptions and cost overruns. Market adoption depends on the success of the growth trials to convince conservative horticultural buyers, while competition from established wood‑fiber suppliers and cheaper peat/coir blends may pressure price and uptake. Regulatory and policy risk exists in multiple forms: changes in fuels program funding could shrink chip volumes; permitting for a processing facility can introduce delays or unexpected costs; and potential shifts in environmental policy—positive or negative—could alter incentives for peat displacement or biomass utilization. Finally, the business depends on a blended capital stack of grants, concessional loans, and commercial finance to bridge capex, so reduced grant availability or loan delays could postpone commercialization.</w:t>
-      </w:r>
-    </w:p>
-    <w:p>
-      <w:r>
-        <w:t xml:space="preserve">Nevertheless, if the validation work and early commercial runs confirm product performance at scale, Plumas Wood Fiber has clear expansion pathways. The model is replicable in other western forest regions with similar fuel treatment byproducts, enabling a distributed network of mid‑sized facilities that feed regional horticultural markets. Product innovation could lead to proprietary blends tailored to specific crops, bagged retail products for consumer markets, or preconditioned fibers designed for large greenhouse operations. Technological improvements—especially extruder energy-efficiency gains and automation in baling and loading—would materially improve margins. Strategic partnerships with large offtakers, soil-blend manufacturers, and impact investors seeking wildfire- and carbon-positive projects could secure long-term revenue streams and flexible capital. Support in the form of grants or incentives that internalize forest restoration and carbon co-benefits could accelerate growth.</w:t>
-      </w:r>
-    </w:p>
-    <w:p>
-      <w:r>
-        <w:t xml:space="preserve">The horticultural industry is projected to significantly expand its use of substrates in the coming decades, with overall demand expected to double or even quadruple. Within that growth, wood fiber substrates are anticipated to see a tenfold increase in adoption—marking this as a high-potential sector where innovative start-ups are well-positioned to lead. However, establishing a viable industry for producing wood fiber substrate from Western forest biomass represents a novel approach for both forestry and horticulture. As a result, both sectors are currently adopting a cautious, wait-and-see stance.</w:t>
-      </w:r>
-    </w:p>
-    <w:p>
-      <w:r>
-        <w:t xml:space="preserve">Biomass enterprises inherently operate on tight margins due to the nature of the material—high volume, low value—and the logistical complexity of sourcing it. Building a viable business under these conditions demands careful planning, operational efficiency, sound partnerships, and strategic coordination. If Plumas Wood Fiber proves successful, it could unlock new opportunities for climate-smart forest management and sustainable horticultural supply chains. If not, it may dampen investor confidence and constrain future efforts to develop alternative biomass-based products. The stakes are high—but so is the opportunity.</w:t>
-      </w:r>
-    </w:p>
-    <w:p>
-      <w:pPr>
-        <w:pStyle w:val="Heading2"/>
-      </w:pPr>
-      <w:r>
-        <w:t xml:space="preserve">1.8	</w:t>
-      </w:r>
-      <w:r>
         <w:t xml:space="preserve">Lessons</w:t>
       </w:r>
     </w:p>
@@ -953,25 +942,25 @@
         <w:pStyle w:val="Heading2"/>
       </w:pPr>
       <w:r>
+        <w:t xml:space="preserve">1.8	</w:t>
+      </w:r>
+      <w:r>
+        <w:t xml:space="preserve">Innovation</w:t>
+      </w:r>
+    </w:p>
+    <w:p>
+      <w:r>
+        <w:t xml:space="preserve">Plumas Wood Fiber has proven the technical and commercial potential of converting excess forest biomass into a market‑ready, peat‑free substrate, with partnerships and pilot results providing a credible path to scale. Achieving commercial success will depend on securing contractable chip volumes, reliable low‑cost energy through strategic co‑location, continued replicated trials to win conservative buyers, and timely access to blended capital. With those elements aligned, Plumas Wood Fiber can deliver a regional, climate‑positive alternative to peat that strengthens forest health, supports local economies, and meets growing demand from the horticulture sector.</w:t>
+      </w:r>
+    </w:p>
+    <w:p>
+      <w:pPr>
+        <w:pStyle w:val="Heading2"/>
+      </w:pPr>
+      <w:r>
         <w:t xml:space="preserve">1.9	</w:t>
       </w:r>
       <w:r>
-        <w:t xml:space="preserve">Innovation</w:t>
-      </w:r>
-    </w:p>
-    <w:p>
-      <w:r>
-        <w:t xml:space="preserve">Plumas Wood Fiber has proven the technical and commercial potential of converting excess forest biomass into a market‑ready, peat‑free substrate, with partnerships and pilot results providing a credible path to scale. Achieving commercial success will depend on securing contractable chip volumes, reliable low‑cost energy through strategic co‑location, continued replicated trials to win conservative buyers, and timely access to blended capital. With those elements aligned, Plumas Wood Fiber can deliver a regional, climate‑positive alternative to peat that strengthens forest health, supports local economies, and meets growing demand from the horticulture sector.</w:t>
-      </w:r>
-    </w:p>
-    <w:p>
-      <w:pPr>
-        <w:pStyle w:val="Heading2"/>
-      </w:pPr>
-      <w:r>
-        <w:t xml:space="preserve">1.10	</w:t>
-      </w:r>
-      <w:r>
         <w:t xml:space="preserve">Credits</w:t>
       </w:r>
     </w:p>
@@ -979,7 +968,7 @@
       <w:r>
         <w:t xml:space="preserve">We recognize and celebrate the innovation and leadership of Plumas Wood Fiber for advancing a practical, circular solution that converts excess forest biomass into a high‑quality, peat‑free horticultural substrate while strengthening regional wildfire resilience. We also extend our deep gratitude to </w:t>
       </w:r>
-      <w:hyperlink w:history="1" r:id="rIdw9ixuojqfqwp4jip34u2d">
+      <w:hyperlink w:history="1" r:id="rIdwcm8mbvuvxnh65ivavq26">
         <w:r>
           <w:rPr>
             <w:rStyle w:val="Hyperlink"/>
@@ -990,7 +979,7 @@
       <w:r>
         <w:t xml:space="preserve"> for funding the Forest Business Alliance’s work with </w:t>
       </w:r>
-      <w:hyperlink w:history="1" r:id="rIdgb_-c8l-cnoo2epvvqdxo">
+      <w:hyperlink w:history="1" r:id="rIdgoqhgvbflms54bhnkz_sy">
         <w:r>
           <w:rPr>
             <w:rStyle w:val="Hyperlink"/>
@@ -1001,7 +990,7 @@
       <w:r>
         <w:t xml:space="preserve">, </w:t>
       </w:r>
-      <w:hyperlink w:history="1" r:id="rIdh-pb3iyuj-vorqpmvmh4z">
+      <w:hyperlink w:history="1" r:id="rId2s0mmyj_wilsjbip0gfyl">
         <w:r>
           <w:rPr>
             <w:rStyle w:val="Hyperlink"/>
@@ -1012,7 +1001,7 @@
       <w:r>
         <w:t xml:space="preserve">, and other community forestry partners across California. Rural and Tribal communities engaged in the forest products sector can benefit from resources, such as the Forest Business Alliance </w:t>
       </w:r>
-      <w:hyperlink w:history="1" r:id="rIdxybqfl-h_gavqrpvn-fmt">
+      <w:hyperlink w:history="1" r:id="rIdzlxjtbvmcvg-pfqeqqoo2">
         <w:r>
           <w:rPr>
             <w:rStyle w:val="Hyperlink"/>
@@ -1023,7 +1012,7 @@
       <w:r>
         <w:t xml:space="preserve">, the </w:t>
       </w:r>
-      <w:hyperlink w:history="1" r:id="rIdwznm6xcpsvatnfse_yjz1">
+      <w:hyperlink w:history="1" r:id="rIdvexkc3d4kdn9cohkicacw">
         <w:r>
           <w:rPr>
             <w:rStyle w:val="Hyperlink"/>
@@ -1034,7 +1023,7 @@
       <w:r>
         <w:t xml:space="preserve">, and upcoming Forest Business Alliance </w:t>
       </w:r>
-      <w:hyperlink w:history="1" r:id="rIdotmwet0qjb6s5ijekcyil">
+      <w:hyperlink w:history="1" r:id="rId1gcvmb2h9jxxanpd_q-tv">
         <w:r>
           <w:rPr>
             <w:rStyle w:val="Hyperlink"/>

</xml_diff>